<commit_message>
Port generate_docx.py to read from docs/includes/*.md, retire content/
generate_docx.py previously re-parsed the retired content/*.txt DSL
with its own duplicate parser. It now reads the same Markdown/HTML
fragments the site itself is built from (via BeautifulSoup), so
there is a single source of truth. content/*.txt and content/pictures/
are removed - docs/includes/ and docs/assets/img/ fully replace them.

Also includes a new engagement (Gemeente Utrecht, 2026) added directly
in docs/includes/engagements/, wired into docs/cv.md.

Co-Authored-By: Claude Sonnet 5 <noreply@anthropic.com>
</commit_message>
<xml_diff>
--- a/docs/assets/cv.docx
+++ b/docs/assets/cv.docx
@@ -209,7 +209,7 @@
                 <w:color w:val="636E72"/>
                 <w:sz w:val="22"/>
               </w:rPr>
-              <w:t>Beschikbaar per</w:t>
+              <w:t>Functie</w:t>
             </w:r>
           </w:p>
         </w:tc>
@@ -228,7 +228,7 @@
               <w:rPr>
                 <w:sz w:val="22"/>
               </w:rPr>
-              <w:t>1 januari 2026</w:t>
+              <w:t>IT-Architect</w:t>
             </w:r>
           </w:p>
         </w:tc>
@@ -251,7 +251,7 @@
                 <w:color w:val="636E72"/>
                 <w:sz w:val="22"/>
               </w:rPr>
-              <w:t>Functie</w:t>
+              <w:t>Beschikbaar per</w:t>
             </w:r>
           </w:p>
         </w:tc>
@@ -270,7 +270,7 @@
               <w:rPr>
                 <w:sz w:val="22"/>
               </w:rPr>
-              <w:t>IT-Architect</w:t>
+              <w:t>1 januari 2026</w:t>
             </w:r>
           </w:p>
         </w:tc>
@@ -384,10 +384,7 @@
         <w:t xml:space="preserve">1997  </w:t>
       </w:r>
       <w:r>
-        <w:t>PION</w:t>
-      </w:r>
-      <w:r>
-        <w:t xml:space="preserve"> — Siemens</w:t>
+        <w:t>PION — Siemens</w:t>
       </w:r>
       <w:r>
         <w:t>, Den Haag</w:t>
@@ -405,10 +402,7 @@
         <w:t xml:space="preserve">1989–1995  </w:t>
       </w:r>
       <w:r>
-        <w:t>WO Algemene Economie</w:t>
-      </w:r>
-      <w:r>
-        <w:t xml:space="preserve"> — Erasmus Universiteit</w:t>
+        <w:t>WO Algemene Economie — Erasmus Universiteit</w:t>
       </w:r>
       <w:r>
         <w:t>, Rotterdam</w:t>
@@ -426,10 +420,7 @@
         <w:t xml:space="preserve">1983–1989  </w:t>
       </w:r>
       <w:r>
-        <w:t>VWO</w:t>
-      </w:r>
-      <w:r>
-        <w:t xml:space="preserve"> — Willem de Zwijger</w:t>
+        <w:t>VWO — Willem de Zwijger</w:t>
       </w:r>
       <w:r>
         <w:t>, Schoonhoven</w:t>
@@ -463,10 +454,7 @@
         <w:t xml:space="preserve">2025  </w:t>
       </w:r>
       <w:r>
-        <w:t>ArchiMate® 3</w:t>
-      </w:r>
-      <w:r>
-        <w:t xml:space="preserve"> — The Open Group</w:t>
+        <w:t>ArchiMate® 3 — The Open Group</w:t>
       </w:r>
     </w:p>
     <w:p>
@@ -480,10 +468,7 @@
         <w:t xml:space="preserve">2022  </w:t>
       </w:r>
       <w:r>
-        <w:t>SAFe@ 5 Architect</w:t>
-      </w:r>
-      <w:r>
-        <w:t xml:space="preserve"> — Scaled Agile Inc</w:t>
+        <w:t>SAFe@ 5 Architect — Scaled Agile Inc</w:t>
       </w:r>
     </w:p>
     <w:p>
@@ -497,10 +482,7 @@
         <w:t xml:space="preserve">2019  </w:t>
       </w:r>
       <w:r>
-        <w:t>SOA Professional Gen 1 (mod 1,3, 8) (Honors)</w:t>
-      </w:r>
-      <w:r>
-        <w:t xml:space="preserve"> — Arcitura</w:t>
+        <w:t>SOA Professional Gen 1 (mod 1,3, 8) (Honors) — Arcitura</w:t>
       </w:r>
     </w:p>
     <w:p>
@@ -685,6 +667,117 @@
         <w:rPr>
           <w:color w:val="636E72"/>
         </w:rPr>
+        <w:t xml:space="preserve">2026 – heden  </w:t>
+      </w:r>
+      <w:r>
+        <w:t>Gemeente Utrecht</w:t>
+      </w:r>
+      <w:r>
+        <w:t xml:space="preserve"> — ICT-Architect</w:t>
+      </w:r>
+    </w:p>
+    <w:p>
+      <w:pPr>
+        <w:spacing w:after="60"/>
+      </w:pPr>
+      <w:r>
+        <w:rPr>
+          <w:b/>
+          <w:color w:val="636E72"/>
+          <w:sz w:val="20"/>
+        </w:rPr>
+        <w:t>Werkzaamheden</w:t>
+      </w:r>
+    </w:p>
+    <w:p>
+      <w:pPr>
+        <w:spacing w:after="120"/>
+      </w:pPr>
+      <w:r>
+        <w:t>• Opstellen van Project Start Architecturen (PSA's) voor digitale voorzieningen, aansluitend op de Common Ground-principes.</w:t>
+      </w:r>
+      <w:r>
+        <w:br/>
+      </w:r>
+      <w:r>
+        <w:t>• Afstemming met leveranciers over doorontwikkeling van applicaties en componenten conform Common Ground; beoordelen van roadmaps en architectuurkeuzes.</w:t>
+      </w:r>
+      <w:r>
+        <w:br/>
+      </w:r>
+      <w:r>
+        <w:t>• Adviseren over de transitie van monolithische naar componentgerichte architectuur op basis van open standaarden en herbruikbare bouwstenen.</w:t>
+      </w:r>
+      <w:r>
+        <w:br/>
+      </w:r>
+      <w:r>
+        <w:t>• Bijdragen aan gemeentebrede architectuurkaders en het vertalen van GEMMA-richtlijnen naar concrete oplossingen.</w:t>
+      </w:r>
+    </w:p>
+    <w:p>
+      <w:pPr>
+        <w:spacing w:after="60"/>
+      </w:pPr>
+      <w:r>
+        <w:rPr>
+          <w:b/>
+          <w:color w:val="636E72"/>
+          <w:sz w:val="20"/>
+        </w:rPr>
+        <w:t>Belangrijkste prestaties</w:t>
+      </w:r>
+    </w:p>
+    <w:p>
+      <w:pPr>
+        <w:spacing w:after="120"/>
+      </w:pPr>
+      <w:r>
+        <w:t>• PSA's opgeleverd die als leidraad dienen voor leveranciersgesprekken en interne besluitvorming rondom Common Ground-implementatie.</w:t>
+      </w:r>
+      <w:r>
+        <w:br/>
+      </w:r>
+      <w:r>
+        <w:t>• Leveranciers constructief begeleid in het aligneren van hun productontwikkeling op Common Ground-principes en open standaarden.</w:t>
+      </w:r>
+    </w:p>
+    <w:p>
+      <w:pPr>
+        <w:spacing w:after="60"/>
+      </w:pPr>
+      <w:r>
+        <w:rPr>
+          <w:b/>
+          <w:color w:val="636E72"/>
+          <w:sz w:val="20"/>
+        </w:rPr>
+        <w:t>Trefwoorden</w:t>
+      </w:r>
+    </w:p>
+    <w:p>
+      <w:pPr>
+        <w:spacing w:after="120"/>
+      </w:pPr>
+      <w:r>
+        <w:t>Common Ground, GEMMA, PSA, API-first, NL API Strategie, Zaakgericht werken, Haven, Kubernetes, leveranciersmanagement, Digitalisering overheid</w:t>
+      </w:r>
+    </w:p>
+    <w:p>
+      <w:pPr>
+        <w:pBdr>
+          <w:bottom w:val="single" w:sz="6" w:space="1" w:color="B2BEC3"/>
+        </w:pBdr>
+      </w:pPr>
+    </w:p>
+    <w:p>
+      <w:pPr>
+        <w:spacing w:after="120"/>
+      </w:pPr>
+      <w:r>
+        <w:rPr>
+          <w:color w:val="636E72"/>
+        </w:rPr>
         <w:t xml:space="preserve">2025 – heden  </w:t>
       </w:r>
       <w:r>
@@ -737,6 +830,48 @@
       </w:r>
       <w:r>
         <w:t>• Verbeterde samenhang tussen infrastructuur, applicaties en dienstverlening; focus op betrouwbaarheid, beveiliging en beheersbaarheid.</w:t>
+      </w:r>
+    </w:p>
+    <w:p>
+      <w:pPr>
+        <w:spacing w:after="60"/>
+      </w:pPr>
+      <w:r>
+        <w:rPr>
+          <w:b/>
+          <w:color w:val="636E72"/>
+          <w:sz w:val="20"/>
+        </w:rPr>
+        <w:t>Belangrijkste prestaties</w:t>
+      </w:r>
+    </w:p>
+    <w:p>
+      <w:pPr>
+        <w:spacing w:after="120"/>
+      </w:pPr>
+      <w:r>
+        <w:t>• Architectuurdenken verankerd in de organisatie door een reeks minicursussen en praktische templates; teams betrekken nu vroegtijdig architectuur en besluiten worden vastgelegd met ADR’s.</w:t>
+      </w:r>
+    </w:p>
+    <w:p>
+      <w:pPr>
+        <w:spacing w:after="60"/>
+      </w:pPr>
+      <w:r>
+        <w:rPr>
+          <w:b/>
+          <w:color w:val="636E72"/>
+          <w:sz w:val="20"/>
+        </w:rPr>
+        <w:t>Trefwoorden</w:t>
+      </w:r>
+    </w:p>
+    <w:p>
+      <w:pPr>
+        <w:spacing w:after="120"/>
+      </w:pPr>
+      <w:r>
+        <w:t>GEMMA, Common Ground, BlueDolphin, Digitalisering overheid, Federatieve Service Connectiviteit (FSC), API-Gateway</w:t>
       </w:r>
     </w:p>
     <w:p>
@@ -798,6 +933,54 @@
     </w:p>
     <w:p>
       <w:pPr>
+        <w:spacing w:after="60"/>
+      </w:pPr>
+      <w:r>
+        <w:rPr>
+          <w:b/>
+          <w:color w:val="636E72"/>
+          <w:sz w:val="20"/>
+        </w:rPr>
+        <w:t>Belangrijkste prestaties</w:t>
+      </w:r>
+    </w:p>
+    <w:p>
+      <w:pPr>
+        <w:spacing w:after="120"/>
+      </w:pPr>
+      <w:r>
+        <w:t>• Door agile-teams actief te ondersteunen en aandachtig te luisteren naar hun uitdagingen, heb ik bijgedragen aan een cultuur waarin externe ontwikkelaars zich verbonden voelen met de doelstellingen van de Belastingdienst. Dit stimuleert hen om met betrokkenheid en toewijding te werken aan deze doelen en versterkt de innovatiekracht binnen de organisatie, waardoor het ontwikkelen van software steeds aantrekkelijker wordt.</w:t>
+      </w:r>
+    </w:p>
+    <w:p>
+      <w:pPr>
+        <w:spacing w:after="60"/>
+      </w:pPr>
+      <w:r>
+        <w:rPr>
+          <w:b/>
+          <w:color w:val="636E72"/>
+          <w:sz w:val="20"/>
+        </w:rPr>
+        <w:t>Trefwoorden</w:t>
+      </w:r>
+    </w:p>
+    <w:p>
+      <w:pPr>
+        <w:spacing w:after="120"/>
+      </w:pPr>
+      <w:r>
+        <w:t>Service Oriented Architecture, SAFE, migratie monolithisch systeem naar microservices, micro frontend, IAM</w:t>
+      </w:r>
+      <w:r>
+        <w:br/>
+      </w:r>
+      <w:r>
+        <w:t>gi</w:t>
+      </w:r>
+    </w:p>
+    <w:p>
+      <w:pPr>
         <w:pBdr>
           <w:bottom w:val="single" w:sz="6" w:space="1" w:color="B2BEC3"/>
         </w:pBdr>
@@ -855,6 +1038,48 @@
     </w:p>
     <w:p>
       <w:pPr>
+        <w:spacing w:after="60"/>
+      </w:pPr>
+      <w:r>
+        <w:rPr>
+          <w:b/>
+          <w:color w:val="636E72"/>
+          <w:sz w:val="20"/>
+        </w:rPr>
+        <w:t>Belangrijkste prestaties</w:t>
+      </w:r>
+    </w:p>
+    <w:p>
+      <w:pPr>
+        <w:spacing w:after="120"/>
+      </w:pPr>
+      <w:r>
+        <w:t>Herziening van de technologiekeuzes waarbij de doeltechnologie is herzien. Daarnaast heb ik de keuzes op het gebied van orkestratie en asynchrone verwerkingen en communicatiepatronen vastgelegd en uitgedragen aan de teams.</w:t>
+      </w:r>
+    </w:p>
+    <w:p>
+      <w:pPr>
+        <w:spacing w:after="60"/>
+      </w:pPr>
+      <w:r>
+        <w:rPr>
+          <w:b/>
+          <w:color w:val="636E72"/>
+          <w:sz w:val="20"/>
+        </w:rPr>
+        <w:t>Trefwoorden</w:t>
+      </w:r>
+    </w:p>
+    <w:p>
+      <w:pPr>
+        <w:spacing w:after="120"/>
+      </w:pPr>
+      <w:r>
+        <w:t>Service Oriented Architecture, SAFE, migratie monolithisch systeem naar microservices, micro frontend, IAM</w:t>
+      </w:r>
+    </w:p>
+    <w:p>
+      <w:pPr>
         <w:pBdr>
           <w:bottom w:val="single" w:sz="6" w:space="1" w:color="B2BEC3"/>
         </w:pBdr>
@@ -896,6 +1121,48 @@
       </w:pPr>
       <w:r>
         <w:t>In het hoofdontwerpteam Inkomensheffing was ik medeverantwoordelijk voor het beschrijven van de solution op basis van de domeinarchitectuur; ik heb het team versterkt door een SOA-certificeringstraject te initiëren en de principes direct in de praktijk te brengen. Als projectarchitect voor Inkomensheffing was ik aanspreekpunt voor regelanalyse vraagstukken. Mijn kerntaken bestonden uit het opstellen van van impactanalyses en het  vastleggen van een referentie architectuur voor het realiseren van een service georiënteerd landschap.</w:t>
+      </w:r>
+    </w:p>
+    <w:p>
+      <w:pPr>
+        <w:spacing w:after="60"/>
+      </w:pPr>
+      <w:r>
+        <w:rPr>
+          <w:b/>
+          <w:color w:val="636E72"/>
+          <w:sz w:val="20"/>
+        </w:rPr>
+        <w:t>Belangrijkste prestaties</w:t>
+      </w:r>
+    </w:p>
+    <w:p>
+      <w:pPr>
+        <w:spacing w:after="120"/>
+      </w:pPr>
+      <w:r>
+        <w:t>Met mijn uitgebreide kennis van ontwikkeling van een service georiënteerd landschap heb ik de architecten van de IH enthousiast kunnen maken om dit complexe vraagstuk aan te pakken.</w:t>
+      </w:r>
+    </w:p>
+    <w:p>
+      <w:pPr>
+        <w:spacing w:after="60"/>
+      </w:pPr>
+      <w:r>
+        <w:rPr>
+          <w:b/>
+          <w:color w:val="636E72"/>
+          <w:sz w:val="20"/>
+        </w:rPr>
+        <w:t>Trefwoorden</w:t>
+      </w:r>
+    </w:p>
+    <w:p>
+      <w:pPr>
+        <w:spacing w:after="120"/>
+      </w:pPr>
+      <w:r>
+        <w:t>Service Oriented Architecture, Regelanalyse, impactanalyse</w:t>
       </w:r>
     </w:p>
     <w:p>
@@ -957,6 +1224,48 @@
     </w:p>
     <w:p>
       <w:pPr>
+        <w:spacing w:after="60"/>
+      </w:pPr>
+      <w:r>
+        <w:rPr>
+          <w:b/>
+          <w:color w:val="636E72"/>
+          <w:sz w:val="20"/>
+        </w:rPr>
+        <w:t>Belangrijkste prestaties</w:t>
+      </w:r>
+    </w:p>
+    <w:p>
+      <w:pPr>
+        <w:spacing w:after="120"/>
+      </w:pPr>
+      <w:r>
+        <w:t>In 2010 ben ik gevraagd om IT-architectuur in te richten bij een kleine IT organisatie. In 2018 zijn er zes IT-architecten in functie bij Stater, ligt er een door Gartner als kwalitatief zeer goed beoordeelde referentiearchitectuur voor digitale transformatie en is IT-architectuur vanzelfsprekend in de inmiddels middelgrote IT-organisatie.</w:t>
+      </w:r>
+    </w:p>
+    <w:p>
+      <w:pPr>
+        <w:spacing w:after="60"/>
+      </w:pPr>
+      <w:r>
+        <w:rPr>
+          <w:b/>
+          <w:color w:val="636E72"/>
+          <w:sz w:val="20"/>
+        </w:rPr>
+        <w:t>Trefwoorden</w:t>
+      </w:r>
+    </w:p>
+    <w:p>
+      <w:pPr>
+        <w:spacing w:after="120"/>
+      </w:pPr>
+      <w:r>
+        <w:t>DYA,PSA, Digitalisering, migratie van monoliet naar microservices</w:t>
+      </w:r>
+    </w:p>
+    <w:p>
+      <w:pPr>
         <w:pBdr>
           <w:bottom w:val="single" w:sz="6" w:space="1" w:color="B2BEC3"/>
         </w:pBdr>
@@ -1014,6 +1323,48 @@
     </w:p>
     <w:p>
       <w:pPr>
+        <w:spacing w:after="60"/>
+      </w:pPr>
+      <w:r>
+        <w:rPr>
+          <w:b/>
+          <w:color w:val="636E72"/>
+          <w:sz w:val="20"/>
+        </w:rPr>
+        <w:t>Belangrijkste prestaties</w:t>
+      </w:r>
+    </w:p>
+    <w:p>
+      <w:pPr>
+        <w:spacing w:after="120"/>
+      </w:pPr>
+      <w:r>
+        <w:t>Zelfstandig analyse en regie uitgevoerd over complexe conversie-issues in onbekend domein. Succesvolle, grote conversie van hypotheekportefeuille.</w:t>
+      </w:r>
+    </w:p>
+    <w:p>
+      <w:pPr>
+        <w:spacing w:after="60"/>
+      </w:pPr>
+      <w:r>
+        <w:rPr>
+          <w:b/>
+          <w:color w:val="636E72"/>
+          <w:sz w:val="20"/>
+        </w:rPr>
+        <w:t>Trefwoorden</w:t>
+      </w:r>
+    </w:p>
+    <w:p>
+      <w:pPr>
+        <w:spacing w:after="120"/>
+      </w:pPr>
+      <w:r>
+        <w:t>Hypotheken, migratie hypotheekportefeuille, Data-warehouse</w:t>
+      </w:r>
+    </w:p>
+    <w:p>
+      <w:pPr>
         <w:pBdr>
           <w:bottom w:val="single" w:sz="6" w:space="1" w:color="B2BEC3"/>
         </w:pBdr>
@@ -1055,6 +1406,48 @@
       </w:pPr>
       <w:r>
         <w:t>Vanaf 2005 verantwoordelijk voor de informatieanalyse, onderhoud logisch datamodel, functioneel ontwerp en test in een omgeving waarbij ontwikkeling in India werd uitgevoerd.</w:t>
+      </w:r>
+    </w:p>
+    <w:p>
+      <w:pPr>
+        <w:spacing w:after="60"/>
+      </w:pPr>
+      <w:r>
+        <w:rPr>
+          <w:b/>
+          <w:color w:val="636E72"/>
+          <w:sz w:val="20"/>
+        </w:rPr>
+        <w:t>Belangrijkste prestaties</w:t>
+      </w:r>
+    </w:p>
+    <w:p>
+      <w:pPr>
+        <w:spacing w:after="120"/>
+      </w:pPr>
+      <w:r>
+        <w:t>Regiefunctie bij de succesvolle conversie van de splitsing van de energiemarkt in Nederland.</w:t>
+      </w:r>
+    </w:p>
+    <w:p>
+      <w:pPr>
+        <w:spacing w:after="60"/>
+      </w:pPr>
+      <w:r>
+        <w:rPr>
+          <w:b/>
+          <w:color w:val="636E72"/>
+          <w:sz w:val="20"/>
+        </w:rPr>
+        <w:t>Trefwoorden</w:t>
+      </w:r>
+    </w:p>
+    <w:p>
+      <w:pPr>
+        <w:spacing w:after="120"/>
+      </w:pPr>
+      <w:r>
+        <w:t>Outsourcing India, splitsing energiemarkt, conversie</w:t>
       </w:r>
     </w:p>
     <w:p>
@@ -1106,6 +1499,48 @@
       </w:r>
       <w:r>
         <w:t>Vanaf 2001 was ik ontwikkelaar in het onderhoudsteam van een energieleverancier en initieerde ik continue verbetering, waaronder het automatiseren van OTAP-releases voor de billing-applicatie.</w:t>
+      </w:r>
+    </w:p>
+    <w:p>
+      <w:pPr>
+        <w:spacing w:after="60"/>
+      </w:pPr>
+      <w:r>
+        <w:rPr>
+          <w:b/>
+          <w:color w:val="636E72"/>
+          <w:sz w:val="20"/>
+        </w:rPr>
+        <w:t>Belangrijkste prestaties</w:t>
+      </w:r>
+    </w:p>
+    <w:p>
+      <w:pPr>
+        <w:spacing w:after="120"/>
+      </w:pPr>
+      <w:r>
+        <w:t>Continu verbeterproces vormgegeven voor het uitvoeren van applicatieonderhoud (ITIL). Als jong talent ook ingezet bij Atos Origin om landelijk verbeteringen door te voeren.</w:t>
+      </w:r>
+    </w:p>
+    <w:p>
+      <w:pPr>
+        <w:spacing w:after="60"/>
+      </w:pPr>
+      <w:r>
+        <w:rPr>
+          <w:b/>
+          <w:color w:val="636E72"/>
+          <w:sz w:val="20"/>
+        </w:rPr>
+        <w:t>Trefwoorden</w:t>
+      </w:r>
+    </w:p>
+    <w:p>
+      <w:pPr>
+        <w:spacing w:after="120"/>
+      </w:pPr>
+      <w:r>
+        <w:t>Oracle, ITIL, biling-applicatie, bankwezen, energiesector</w:t>
       </w:r>
     </w:p>
     <w:p>

</xml_diff>

<commit_message>
Fix garbled achievement line and reapply keyword typo fix
2026-heden.yml: "Verbeteren samenwerkingsoverlegstructurenchitecten" ->
"Verbeteren overlegstructuren architecten" (per user), and reapply the
earlier "Bizz Desgign" -> "BiZZdesign" fix, which had been reverted by
an intervening edit. Regenerates cv.pdf/cv.docx.

Co-Authored-By: Claude Sonnet 5 <noreply@anthropic.com>
</commit_message>
<xml_diff>
--- a/docs/assets/cv.docx
+++ b/docs/assets/cv.docx
@@ -751,13 +751,19 @@
         <w:spacing w:after="120"/>
       </w:pPr>
       <w:r>
-        <w:t>• PSA's opgeleverd die als leidraad dienen voor leveranciersgesprekken en interne besluitvorming rondom Common Ground-implementatie.</w:t>
+        <w:t>• Leveranciers constructief begeleid in het aligneren van hun productontwikkeling op Common Ground-principes en open standaarden.</w:t>
       </w:r>
       <w:r>
         <w:br/>
       </w:r>
       <w:r>
-        <w:t>• Leveranciers constructief begeleid in het aligneren van hun productontwikkeling op Common Ground-principes en open standaarden.</w:t>
+        <w:t>• Bestaande Thema-architectuur vertaald naar Archimate views.</w:t>
+      </w:r>
+      <w:r>
+        <w:br/>
+      </w:r>
+      <w:r>
+        <w:t>• Verbeteren overlegstructuren architecten</w:t>
       </w:r>
     </w:p>
     <w:p>

</xml_diff>

<commit_message>
DOCX: black section titles, icon-based contact line without raw URLs
- Section titles reverted from accent blue back to the site's regular
  text-primary black (#111) - the blue read as too loud in practice.
- Contact line rewritten: emoji icon + short label only (LinkedIn,
  Website, GitHub, phone number, email address), each a real
  clickable hyperlink to the underlying url - no more raw URLs
  printed out in full. Added a low-level add_hyperlink() helper since
  python-docx has no built-in API for it.

Co-Authored-By: Claude Sonnet 5 <noreply@anthropic.com>
</commit_message>
<xml_diff>
--- a/docs/assets/cv.docx
+++ b/docs/assets/cv.docx
@@ -6,7 +6,7 @@
       <w:r>
         <w:rPr>
           <w:b/>
-          <w:color w:val="0A66C2"/>
+          <w:color w:val="111111"/>
           <w:sz w:val="22"/>
         </w:rPr>
         <w:t>PERSOONLIJKE GEGEVENS</w:t>
@@ -58,11 +58,103 @@
       </w:pPr>
       <w:r>
         <w:rPr>
-          <w:color w:val="636E72"/>
           <w:sz w:val="19"/>
         </w:rPr>
-        <w:t>LinkedIn: https://www.linkedin.com/in/hans-blok/ · Website: https://www.2-minuten-it-architectuur.nl/ · GitHub: https://github.com/hans-blok · 06 3045 1822 · hans.blok@the-future-group.com</w:t>
+        <w:t xml:space="preserve">🔗 </w:t>
       </w:r>
+      <w:hyperlink r:id="rId10">
+        <w:r>
+          <w:rPr>
+            <w:color w:val="1155CC"/>
+            <w:sz w:val="19"/>
+          </w:rPr>
+          <w:t>LinkedIn</w:t>
+        </w:r>
+      </w:hyperlink>
+      <w:r>
+        <w:rPr>
+          <w:sz w:val="19"/>
+        </w:rPr>
+        <w:t xml:space="preserve">     </w:t>
+      </w:r>
+      <w:r>
+        <w:rPr>
+          <w:sz w:val="19"/>
+        </w:rPr>
+        <w:t xml:space="preserve">🌐 </w:t>
+      </w:r>
+      <w:hyperlink r:id="rId11">
+        <w:r>
+          <w:rPr>
+            <w:color w:val="1155CC"/>
+            <w:sz w:val="19"/>
+          </w:rPr>
+          <w:t>Website</w:t>
+        </w:r>
+      </w:hyperlink>
+      <w:r>
+        <w:rPr>
+          <w:sz w:val="19"/>
+        </w:rPr>
+        <w:t xml:space="preserve">     </w:t>
+      </w:r>
+      <w:r>
+        <w:rPr>
+          <w:sz w:val="19"/>
+        </w:rPr>
+        <w:t xml:space="preserve">💻 </w:t>
+      </w:r>
+      <w:hyperlink r:id="rId12">
+        <w:r>
+          <w:rPr>
+            <w:color w:val="1155CC"/>
+            <w:sz w:val="19"/>
+          </w:rPr>
+          <w:t>GitHub</w:t>
+        </w:r>
+      </w:hyperlink>
+      <w:r>
+        <w:rPr>
+          <w:sz w:val="19"/>
+        </w:rPr>
+        <w:t xml:space="preserve">     </w:t>
+      </w:r>
+      <w:r>
+        <w:rPr>
+          <w:sz w:val="19"/>
+        </w:rPr>
+        <w:t xml:space="preserve">☎ </w:t>
+      </w:r>
+      <w:hyperlink r:id="rId13">
+        <w:r>
+          <w:rPr>
+            <w:color w:val="1155CC"/>
+            <w:sz w:val="19"/>
+          </w:rPr>
+          <w:t>06 3045 1822</w:t>
+        </w:r>
+      </w:hyperlink>
+      <w:r>
+        <w:rPr>
+          <w:sz w:val="19"/>
+        </w:rPr>
+        <w:t xml:space="preserve">     </w:t>
+      </w:r>
+      <w:r>
+        <w:rPr>
+          <w:sz w:val="19"/>
+        </w:rPr>
+        <w:t xml:space="preserve">✉ </w:t>
+      </w:r>
+      <w:hyperlink r:id="rId14">
+        <w:r>
+          <w:rPr>
+            <w:color w:val="1155CC"/>
+            <w:sz w:val="19"/>
+          </w:rPr>
+          <w:t>hans.blok@the-future-group.com</w:t>
+        </w:r>
+      </w:hyperlink>
     </w:p>
     <w:tbl>
       <w:tblPr>
@@ -338,7 +430,7 @@
       <w:r>
         <w:rPr>
           <w:b/>
-          <w:color w:val="0A66C2"/>
+          <w:color w:val="111111"/>
           <w:sz w:val="22"/>
         </w:rPr>
         <w:t>KERNEXPERTISE</w:t>
@@ -1282,7 +1374,7 @@
       <w:r>
         <w:rPr>
           <w:b/>
-          <w:color w:val="0A66C2"/>
+          <w:color w:val="111111"/>
           <w:sz w:val="22"/>
         </w:rPr>
         <w:t>ACHTERGROND</w:t>
@@ -1439,7 +1531,7 @@
       <w:r>
         <w:rPr>
           <w:b/>
-          <w:color w:val="0A66C2"/>
+          <w:color w:val="111111"/>
           <w:sz w:val="22"/>
         </w:rPr>
         <w:t>CURSUSSEN</w:t>
@@ -1596,7 +1688,7 @@
       <w:r>
         <w:rPr>
           <w:b/>
-          <w:color w:val="0A66C2"/>
+          <w:color w:val="111111"/>
           <w:sz w:val="22"/>
         </w:rPr>
         <w:t>OVERIGE CURSUSSEN</w:t>
@@ -1621,7 +1713,7 @@
       <w:r>
         <w:rPr>
           <w:b/>
-          <w:color w:val="0A66C2"/>
+          <w:color w:val="111111"/>
           <w:sz w:val="22"/>
         </w:rPr>
         <w:t>WERKERVARING</w:t>

</xml_diff>

<commit_message>
DOCX: stack contact icons vertically, left of the photo
Replaces the single horizontal contact line with a borderless 2-column
table: contact items stacked one per line on the left, profile photo
on the right - closer to how the site's sidebar groups these together.

Co-Authored-By: Claude Sonnet 5 <noreply@anthropic.com>
</commit_message>
<xml_diff>
--- a/docs/assets/cv.docx
+++ b/docs/assets/cv.docx
@@ -12,149 +12,184 @@
         <w:t>PERSOONLIJKE GEGEVENS</w:t>
       </w:r>
     </w:p>
+    <w:tbl>
+      <w:tblPr>
+        <w:tblW w:type="auto" w:w="0"/>
+        <w:tblLayout w:type="fixed"/>
+        <w:tblLook w:firstColumn="1" w:firstRow="1" w:lastColumn="0" w:lastRow="0" w:noHBand="0" w:noVBand="1" w:val="04A0"/>
+      </w:tblPr>
+      <w:tblGrid>
+        <w:gridCol w:w="5400"/>
+        <w:gridCol w:w="5400"/>
+      </w:tblGrid>
+      <w:tr>
+        <w:tc>
+          <w:tcPr>
+            <w:tcW w:type="dxa" w:w="7200"/>
+            <w:tcBorders>
+              <w:top w:val="none"/>
+              <w:left w:val="none"/>
+              <w:bottom w:val="none"/>
+              <w:right w:val="none"/>
+            </w:tcBorders>
+          </w:tcPr>
+          <w:p>
+            <w:pPr>
+              <w:spacing w:after="40"/>
+            </w:pPr>
+            <w:r>
+              <w:rPr>
+                <w:sz w:val="19"/>
+              </w:rPr>
+              <w:t xml:space="preserve">🔗 </w:t>
+            </w:r>
+            <w:hyperlink r:id="rId9">
+              <w:r>
+                <w:rPr>
+                  <w:color w:val="1155CC"/>
+                  <w:sz w:val="19"/>
+                </w:rPr>
+                <w:t>LinkedIn</w:t>
+              </w:r>
+            </w:hyperlink>
+          </w:p>
+          <w:p>
+            <w:pPr>
+              <w:spacing w:after="40"/>
+            </w:pPr>
+            <w:r>
+              <w:rPr>
+                <w:sz w:val="19"/>
+              </w:rPr>
+              <w:t xml:space="preserve">🌐 </w:t>
+            </w:r>
+            <w:hyperlink r:id="rId10">
+              <w:r>
+                <w:rPr>
+                  <w:color w:val="1155CC"/>
+                  <w:sz w:val="19"/>
+                </w:rPr>
+                <w:t>Website</w:t>
+              </w:r>
+            </w:hyperlink>
+          </w:p>
+          <w:p>
+            <w:pPr>
+              <w:spacing w:after="40"/>
+            </w:pPr>
+            <w:r>
+              <w:rPr>
+                <w:sz w:val="19"/>
+              </w:rPr>
+              <w:t xml:space="preserve">💻 </w:t>
+            </w:r>
+            <w:hyperlink r:id="rId11">
+              <w:r>
+                <w:rPr>
+                  <w:color w:val="1155CC"/>
+                  <w:sz w:val="19"/>
+                </w:rPr>
+                <w:t>GitHub</w:t>
+              </w:r>
+            </w:hyperlink>
+          </w:p>
+          <w:p>
+            <w:pPr>
+              <w:spacing w:after="40"/>
+            </w:pPr>
+            <w:r>
+              <w:rPr>
+                <w:sz w:val="19"/>
+              </w:rPr>
+              <w:t xml:space="preserve">☎ </w:t>
+            </w:r>
+            <w:hyperlink r:id="rId12">
+              <w:r>
+                <w:rPr>
+                  <w:color w:val="1155CC"/>
+                  <w:sz w:val="19"/>
+                </w:rPr>
+                <w:t>06 3045 1822</w:t>
+              </w:r>
+            </w:hyperlink>
+          </w:p>
+          <w:p>
+            <w:pPr>
+              <w:spacing w:after="40"/>
+            </w:pPr>
+            <w:r>
+              <w:rPr>
+                <w:sz w:val="19"/>
+              </w:rPr>
+              <w:t xml:space="preserve">✉ </w:t>
+            </w:r>
+            <w:hyperlink r:id="rId13">
+              <w:r>
+                <w:rPr>
+                  <w:color w:val="1155CC"/>
+                  <w:sz w:val="19"/>
+                </w:rPr>
+                <w:t>hans.blok@the-future-group.com</w:t>
+              </w:r>
+            </w:hyperlink>
+          </w:p>
+        </w:tc>
+        <w:tc>
+          <w:tcPr>
+            <w:tcW w:type="dxa" w:w="2016"/>
+            <w:tcBorders>
+              <w:top w:val="none"/>
+              <w:left w:val="none"/>
+              <w:bottom w:val="none"/>
+              <w:right w:val="none"/>
+            </w:tcBorders>
+          </w:tcPr>
+          <w:p>
+            <w:pPr>
+              <w:jc w:val="right"/>
+            </w:pPr>
+            <w:r>
+              <w:drawing>
+                <wp:inline xmlns:a="http://schemas.openxmlformats.org/drawingml/2006/main" xmlns:pic="http://schemas.openxmlformats.org/drawingml/2006/picture">
+                  <wp:extent cx="1097280" cy="1371935"/>
+                  <wp:docPr id="1" name="Picture 1"/>
+                  <wp:cNvGraphicFramePr>
+                    <a:graphicFrameLocks noChangeAspect="1"/>
+                  </wp:cNvGraphicFramePr>
+                  <a:graphic>
+                    <a:graphicData uri="http://schemas.openxmlformats.org/drawingml/2006/picture">
+                      <pic:pic>
+                        <pic:nvPicPr>
+                          <pic:cNvPr id="0" name="profile-photo.jpg"/>
+                          <pic:cNvPicPr/>
+                        </pic:nvPicPr>
+                        <pic:blipFill>
+                          <a:blip r:embed="rId14"/>
+                          <a:stretch>
+                            <a:fillRect/>
+                          </a:stretch>
+                        </pic:blipFill>
+                        <pic:spPr>
+                          <a:xfrm>
+                            <a:off x="0" y="0"/>
+                            <a:ext cx="1097280" cy="1371935"/>
+                          </a:xfrm>
+                          <a:prstGeom prst="rect"/>
+                        </pic:spPr>
+                      </pic:pic>
+                    </a:graphicData>
+                  </a:graphic>
+                </wp:inline>
+              </w:drawing>
+            </w:r>
+          </w:p>
+        </w:tc>
+      </w:tr>
+    </w:tbl>
     <w:p>
       <w:pPr>
-        <w:spacing w:after="120"/>
-        <w:jc w:val="right"/>
+        <w:spacing w:after="60"/>
       </w:pPr>
-      <w:r>
-        <w:drawing>
-          <wp:inline xmlns:a="http://schemas.openxmlformats.org/drawingml/2006/main" xmlns:pic="http://schemas.openxmlformats.org/drawingml/2006/picture">
-            <wp:extent cx="1097280" cy="1371935"/>
-            <wp:docPr id="1" name="Picture 1"/>
-            <wp:cNvGraphicFramePr>
-              <a:graphicFrameLocks noChangeAspect="1"/>
-            </wp:cNvGraphicFramePr>
-            <a:graphic>
-              <a:graphicData uri="http://schemas.openxmlformats.org/drawingml/2006/picture">
-                <pic:pic>
-                  <pic:nvPicPr>
-                    <pic:cNvPr id="0" name="profile-photo.jpg"/>
-                    <pic:cNvPicPr/>
-                  </pic:nvPicPr>
-                  <pic:blipFill>
-                    <a:blip r:embed="rId9"/>
-                    <a:stretch>
-                      <a:fillRect/>
-                    </a:stretch>
-                  </pic:blipFill>
-                  <pic:spPr>
-                    <a:xfrm>
-                      <a:off x="0" y="0"/>
-                      <a:ext cx="1097280" cy="1371935"/>
-                    </a:xfrm>
-                    <a:prstGeom prst="rect"/>
-                  </pic:spPr>
-                </pic:pic>
-              </a:graphicData>
-            </a:graphic>
-          </wp:inline>
-        </w:drawing>
-      </w:r>
-    </w:p>
-    <w:p>
-      <w:pPr>
-        <w:spacing w:after="160"/>
-      </w:pPr>
-      <w:r>
-        <w:rPr>
-          <w:sz w:val="19"/>
-        </w:rPr>
-        <w:t xml:space="preserve">🔗 </w:t>
-      </w:r>
-      <w:hyperlink r:id="rId10">
-        <w:r>
-          <w:rPr>
-            <w:color w:val="1155CC"/>
-            <w:sz w:val="19"/>
-          </w:rPr>
-          <w:t>LinkedIn</w:t>
-        </w:r>
-      </w:hyperlink>
-      <w:r>
-        <w:rPr>
-          <w:sz w:val="19"/>
-        </w:rPr>
-        <w:t xml:space="preserve">     </w:t>
-      </w:r>
-      <w:r>
-        <w:rPr>
-          <w:sz w:val="19"/>
-        </w:rPr>
-        <w:t xml:space="preserve">🌐 </w:t>
-      </w:r>
-      <w:hyperlink r:id="rId11">
-        <w:r>
-          <w:rPr>
-            <w:color w:val="1155CC"/>
-            <w:sz w:val="19"/>
-          </w:rPr>
-          <w:t>Website</w:t>
-        </w:r>
-      </w:hyperlink>
-      <w:r>
-        <w:rPr>
-          <w:sz w:val="19"/>
-        </w:rPr>
-        <w:t xml:space="preserve">     </w:t>
-      </w:r>
-      <w:r>
-        <w:rPr>
-          <w:sz w:val="19"/>
-        </w:rPr>
-        <w:t xml:space="preserve">💻 </w:t>
-      </w:r>
-      <w:hyperlink r:id="rId12">
-        <w:r>
-          <w:rPr>
-            <w:color w:val="1155CC"/>
-            <w:sz w:val="19"/>
-          </w:rPr>
-          <w:t>GitHub</w:t>
-        </w:r>
-      </w:hyperlink>
-      <w:r>
-        <w:rPr>
-          <w:sz w:val="19"/>
-        </w:rPr>
-        <w:t xml:space="preserve">     </w:t>
-      </w:r>
-      <w:r>
-        <w:rPr>
-          <w:sz w:val="19"/>
-        </w:rPr>
-        <w:t xml:space="preserve">☎ </w:t>
-      </w:r>
-      <w:hyperlink r:id="rId13">
-        <w:r>
-          <w:rPr>
-            <w:color w:val="1155CC"/>
-            <w:sz w:val="19"/>
-          </w:rPr>
-          <w:t>06 3045 1822</w:t>
-        </w:r>
-      </w:hyperlink>
-      <w:r>
-        <w:rPr>
-          <w:sz w:val="19"/>
-        </w:rPr>
-        <w:t xml:space="preserve">     </w:t>
-      </w:r>
-      <w:r>
-        <w:rPr>
-          <w:sz w:val="19"/>
-        </w:rPr>
-        <w:t xml:space="preserve">✉ </w:t>
-      </w:r>
-      <w:hyperlink r:id="rId14">
-        <w:r>
-          <w:rPr>
-            <w:color w:val="1155CC"/>
-            <w:sz w:val="19"/>
-          </w:rPr>
-          <w:t>hans.blok@the-future-group.com</w:t>
-        </w:r>
-      </w:hyperlink>
     </w:p>
     <w:tbl>
       <w:tblPr>

</xml_diff>

<commit_message>
Use the real GitHub icon in the DOCX contact line, not a computer emoji
Pre-rendered docs/assets/img/icons/github.png once from the exact SVG
path the site itself uses (docs/stylesheets/style.css), via headless
Chrome + a Pillow crop. generate_docx.py now embeds this image inline
for the GitHub contact entry instead of the "💻" emoji fallback, which
didn't read as GitHub at all. Other contact types keep their emoji
icon for now.

Co-Authored-By: Claude Sonnet 5 <noreply@anthropic.com>
</commit_message>
<xml_diff>
--- a/docs/assets/cv.docx
+++ b/docs/assets/cv.docx
@@ -78,12 +78,43 @@
               <w:spacing w:after="40"/>
             </w:pPr>
             <w:r>
-              <w:rPr>
-                <w:sz w:val="19"/>
-              </w:rPr>
-              <w:t xml:space="preserve">💻 </w:t>
+              <w:drawing>
+                <wp:inline xmlns:a="http://schemas.openxmlformats.org/drawingml/2006/main" xmlns:pic="http://schemas.openxmlformats.org/drawingml/2006/picture">
+                  <wp:extent cx="139700" cy="139700"/>
+                  <wp:docPr id="1" name="Picture 1"/>
+                  <wp:cNvGraphicFramePr>
+                    <a:graphicFrameLocks noChangeAspect="1"/>
+                  </wp:cNvGraphicFramePr>
+                  <a:graphic>
+                    <a:graphicData uri="http://schemas.openxmlformats.org/drawingml/2006/picture">
+                      <pic:pic>
+                        <pic:nvPicPr>
+                          <pic:cNvPr id="0" name="github.png"/>
+                          <pic:cNvPicPr/>
+                        </pic:nvPicPr>
+                        <pic:blipFill>
+                          <a:blip r:embed="rId11"/>
+                          <a:stretch>
+                            <a:fillRect/>
+                          </a:stretch>
+                        </pic:blipFill>
+                        <pic:spPr>
+                          <a:xfrm>
+                            <a:off x="0" y="0"/>
+                            <a:ext cx="139700" cy="139700"/>
+                          </a:xfrm>
+                          <a:prstGeom prst="rect"/>
+                        </pic:spPr>
+                      </pic:pic>
+                    </a:graphicData>
+                  </a:graphic>
+                </wp:inline>
+              </w:drawing>
             </w:r>
-            <w:hyperlink r:id="rId11">
+            <w:r>
+              <w:t xml:space="preserve"> </w:t>
+            </w:r>
+            <w:hyperlink r:id="rId12">
               <w:r>
                 <w:rPr>
                   <w:color w:val="1155CC"/>
@@ -103,7 +134,7 @@
               </w:rPr>
               <w:t xml:space="preserve">☎ </w:t>
             </w:r>
-            <w:hyperlink r:id="rId12">
+            <w:hyperlink r:id="rId13">
               <w:r>
                 <w:rPr>
                   <w:color w:val="1155CC"/>
@@ -123,7 +154,7 @@
               </w:rPr>
               <w:t xml:space="preserve">✉ </w:t>
             </w:r>
-            <w:hyperlink r:id="rId13">
+            <w:hyperlink r:id="rId14">
               <w:r>
                 <w:rPr>
                   <w:color w:val="1155CC"/>
@@ -152,7 +183,7 @@
               <w:drawing>
                 <wp:inline xmlns:a="http://schemas.openxmlformats.org/drawingml/2006/main" xmlns:pic="http://schemas.openxmlformats.org/drawingml/2006/picture">
                   <wp:extent cx="1097280" cy="1371935"/>
-                  <wp:docPr id="1" name="Picture 1"/>
+                  <wp:docPr id="2" name="Picture 2"/>
                   <wp:cNvGraphicFramePr>
                     <a:graphicFrameLocks noChangeAspect="1"/>
                   </wp:cNvGraphicFramePr>
@@ -164,7 +195,7 @@
                           <pic:cNvPicPr/>
                         </pic:nvPicPr>
                         <pic:blipFill>
-                          <a:blip r:embed="rId14"/>
+                          <a:blip r:embed="rId15"/>
                           <a:stretch>
                             <a:fillRect/>
                           </a:stretch>

</xml_diff>